<commit_message>
fix: lint docx footnote restarts (fb-595.82)
</commit_message>
<xml_diff>
--- a/courts/tenth-circuit/oklahoma/federal/bankruptcy-western-district/adversary-complaint/docx/reference.docx
+++ b/courts/tenth-circuit/oklahoma/federal/bankruptcy-western-district/adversary-complaint/docx/reference.docx
@@ -315,9 +315,7 @@
     </w:p>
     <w:sectPr>
       <w:footerReference w:type="default" r:id="rIdOkwbFooter"/>
-      <w:footnotePr>
-        <w:numRestart w:val="eachSect"/>
-      </w:footnotePr>
+      <w:footnotePr/>
       <w:pgSz w:w="12240" w:h="15840"/>
       <w:pgMar w:top="1440" w:right="1440" w:bottom="1440" w:left="1440" w:header="720" w:footer="720" w:gutter="0"/>
       <w:cols w:space="720"/>

</xml_diff>